<commit_message>
Implement PRD v3 town profiles and public-facing site
</commit_message>
<xml_diff>
--- a/design_document.docx
+++ b/design_document.docx
@@ -29,7 +29,7 @@
     </w:p>
     <w:p>
       <w:r>
-        <w:t>This design document explains the rationale for each visualization used in the Massachusetts Housing Financial Analysis Dashboard. The site combines D3 and Altair to connect housing prices with property characteristics, livability, affordability, and environmental risk. The published website target is: https://nikitaliu.github.io/DS4200-Project/</w:t>
+        <w:t>This design document explains the rationale for each visualization used in the Massachusetts Housing Financial Analysis Dashboard. The site combines D3 and Altair to connect housing prices with property characteristics, livability, affordability, and environmental risk in a format designed for a general public audience. The published website target is: https://nikitaliu.github.io/DS4200-Project/</w:t>
       </w:r>
     </w:p>
     <w:p>
@@ -42,7 +42,7 @@
     </w:p>
     <w:p>
       <w:r>
-        <w:t>The choropleth was chosen because the first analytical task is geographic screening: users need to see how valuation, affordability, cap-rate proxy, and environmental risk cluster across Massachusetts. Color is the primary encoding because it is the clearest way to compare one metric across many municipalities on a map, while tooltips carry the supporting values for median income, listing count, and price-to-income ratio. A dropdown was preferred over small multiples because it keeps the map readable on a single page and lets the user reuse the same spatial memory while changing the financial lens. A bubble map and county-level aggregation were rejected because they either distort municipal boundaries or hide town-level variation that matters in housing analysis. From a financial analysis perspective, the map acts like a market-screening dashboard that helps identify premium towns, relative bargains, and places where risk and price move together instead of offsetting each other.</w:t>
+        <w:t>The choropleth was chosen because the first analytical task is geographic screening: users need to see how valuation, affordability, cap-rate proxy, and environmental risk cluster across Massachusetts. Color is the primary encoding because it is the clearest way to compare one metric across many municipalities on a map, while tooltips carry the supporting values for median income, listing count, and price-to-income ratio. A dropdown was preferred over small multiples because it keeps the map readable on a single page and lets the user reuse the same spatial memory while changing the analytical lens. A bubble map and county-level aggregation were rejected because they either distort municipal boundaries or hide town-level variation that matters in housing analysis. Clicking a town opens a profile panel so users can move from a statewide view into local housing, demographic, and employment context without leaving the page. From a financial analysis perspective, the map acts like a market-screening dashboard that helps identify premium towns, relative bargains, and places where risk and price move together instead of offsetting each other.</w:t>
       </w:r>
     </w:p>
     <w:p>
@@ -55,7 +55,7 @@
     </w:p>
     <w:p>
       <w:r>
-        <w:t>The price-driver scatter plot was selected because comparable sales analysis is fundamentally about seeing how listings cluster when a property attribute changes. Square footage, bedrooms, year built, and livability composite appear as interchangeable x-axis choices so users can test different valuation stories without leaving the chart. Price is placed on the y-axis because it is the dependent market outcome, property type is encoded with color to separate market segments, and environmental risk is encoded with point size so the chart can carry one more financial context variable without sacrificing readability. Brush selection was preferred over a static summary because it lets users create their own comp set and immediately inspect the implied mean and median price. A regression line alone was rejected because it hides distributional spread and segment differences that matter to investors and buyers.</w:t>
+        <w:t>The price-driver scatter plot was selected because comparable sales analysis is fundamentally about seeing how listings cluster when a property attribute changes. Square footage, bedrooms, year built, and livability composite appear as interchangeable x-axis choices so users can test different valuation stories without leaving the chart. Price is placed on the y-axis because it is the dependent market outcome, property type is encoded with color to separate market segments, and environmental risk is encoded with point size so the chart can carry one more context variable without sacrificing readability. Brush selection was preferred over a static summary because it lets users create their own comparison set and immediately inspect the implied mean and median price. A regression line alone was rejected because it hides distributional spread and segment differences that matter to home shoppers.</w:t>
       </w:r>
     </w:p>
     <w:p>
@@ -81,7 +81,7 @@
     </w:p>
     <w:p>
       <w:r>
-        <w:t>A box-and-whisker plot is the most appropriate design for showing how each property segment differs not only in median price but also in spread, skew, and outlier behavior. Property type is placed on the x-axis as the main segmentation variable, and listing price is placed on the y-axis so the user can compare medians and IQRs at a glance. Hover tooltips expose the exact quartiles and counts, while clickable outliers reveal individual listing details. Histograms and violin plots were considered, but the box plot was preferred because it more directly communicates risk dispersion and is easier for a finance audience to interpret quickly. This chart supports risk-adjusted valuation by showing which segments have tight distributions and which contain the widest pricing uncertainty.</w:t>
+        <w:t>A box-and-whisker plot is the most appropriate design for showing how each property segment differs not only in median price but also in spread, skew, and outlier behavior. Property type is placed on the x-axis as the main segmentation variable, and listing price is placed on the y-axis so the user can compare medians and IQRs at a glance. Hover tooltips expose the exact quartiles and counts, while clickable outliers reveal individual listing details. Histograms and violin plots were considered, but the box plot was preferred because it more directly communicates risk dispersion and is easier for a mixed audience to interpret quickly. This chart supports segment comparison by showing which home types have tight distributions and which contain the widest pricing uncertainty.</w:t>
       </w:r>
     </w:p>
     <w:p>
@@ -107,7 +107,20 @@
     </w:p>
     <w:p>
       <w:r>
-        <w:t>The income-versus-price scatter plot was chosen to compare local purchasing power against local housing prices in a way that makes overvaluation and relative affordability visible at the town level. Median household income is on the x-axis, median listing price is on the y-axis, population is encoded with point size, and price-to-income ratio is encoded with color to keep the affordability story central. The dashed reference line at four times income provides an interpretable lending-style benchmark. A choropleth alone would not show the cross-town affordability relationship as clearly, and a ranked bar chart would hide how far towns sit above or below a common threshold. This chart is the clearest way to show which towns appear expensive relative to their own economic base and which look more balanced for first-time buyers or value-oriented investors.</w:t>
+        <w:t>The income-versus-price scatter plot was chosen to compare local purchasing power against local housing prices in a way that makes overvaluation and relative affordability visible at the town level. Median household income is on the x-axis, median listing price is on the y-axis, and price-to-income ratio is encoded with color to keep the affordability story central. The dashed reference line at four times income provides an interpretable lending-style benchmark. A choropleth alone would not show the cross-town affordability relationship as clearly, and a ranked bar chart would hide how far towns sit above or below a common threshold. This chart is the clearest way to show which towns appear expensive relative to their own economic base and which look more balanced for first-time buyers or renters comparing where they may have a better chance of staying within reach.</w:t>
+      </w:r>
+    </w:p>
+    <w:p>
+      <w:pPr>
+        <w:pStyle w:val="Heading1"/>
+      </w:pPr>
+      <w:r>
+        <w:t>Town Profile Interaction</w:t>
+      </w:r>
+    </w:p>
+    <w:p>
+      <w:r>
+        <w:t>The choropleth includes a click-through town profile panel inspired by MAPC DataCommon. We chose a slide-in panel instead of generating separate HTML pages because it preserves the single-page storytelling flow required by the course while still giving users a place-specific drill-down. The Housing tab summarizes listing counts, prices, and property-type mix from the cleaned Zillow data. The Demographics tab shows ACS income, tenure, age, and race or ethnicity context. The Employment tab uses ACS industry counts to show what kinds of work are most common in each town. This interaction matters because it helps a general audience move from statewide patterns to town-level context without losing orientation.</w:t>
       </w:r>
     </w:p>
     <w:p>

</xml_diff>

<commit_message>
Improve RQ2 feature driver analysis
</commit_message>
<xml_diff>
--- a/design_document.docx
+++ b/design_document.docx
@@ -55,7 +55,7 @@
     </w:p>
     <w:p>
       <w:r>
-        <w:t>The price-driver scatter plot was selected because comparable sales analysis is fundamentally about seeing how listings cluster when a property attribute changes. Square footage, bedrooms, year built, and livability composite appear as interchangeable x-axis choices so users can test different valuation stories without leaving the chart. Price is placed on the y-axis because it is the dependent market outcome, property type is encoded with color to separate market segments, and environmental risk is encoded with point size so the chart can carry one more context variable without sacrificing readability. Brush selection was preferred over a static summary because it lets users create their own comparison set and immediately inspect the implied mean and median price. A regression line alone was rejected because it hides distributional spread and segment differences that matter to home shoppers.</w:t>
+        <w:t>The price-driver scatter plot was selected because comparable sales analysis is fundamentally about seeing how listings cluster when a property attribute changes. Square footage, bathrooms, bedrooms, and age of home appear as interchangeable x-axis choices so users can test different valuation stories without leaving the chart. Price is placed on the y-axis because it is the dependent market outcome, property type is encoded with color to separate market segments, and environmental risk is encoded with point size so the chart can carry one more context variable without sacrificing readability. A property-type filter and brush selection were preferred over a density toggle because they better support the practical task of building a comparable listing set. A regression line alone was rejected because it hides distributional spread and segment differences that matter to home shoppers.</w:t>
       </w:r>
     </w:p>
     <w:p>
@@ -89,7 +89,20 @@
         <w:pStyle w:val="Heading2"/>
       </w:pPr>
       <w:r>
-        <w:t>Visualization 5 — Altair Correlation Heatmap of Financial and Risk Factors</w:t>
+        <w:t>Visualization 5 — Altair Ranked Bar Chart of Feature Importance</w:t>
+      </w:r>
+    </w:p>
+    <w:p>
+      <w:r>
+        <w:t>The ranked bar chart was added to answer the research question more directly than a scatter plot can on its own. Each bar represents a standardized association between one home feature and listing price after the variables have been put on the same scale, which makes it possible to compare square footage, bathrooms, bedrooms, age, livability, and environmental risk in one view. Bar length was chosen as the main encoding because ranking is the central task, while color communicates whether the association is positive or negative. A table of coefficients was rejected because it is harder for a general audience to scan quickly. This chart translates the broader valuation story into a compact analyst-style summary of which features appear to matter most.</w:t>
+      </w:r>
+    </w:p>
+    <w:p>
+      <w:pPr>
+        <w:pStyle w:val="Heading2"/>
+      </w:pPr>
+      <w:r>
+        <w:t>Visualization 6 — Altair Correlation Heatmap of Financial and Risk Factors</w:t>
       </w:r>
     </w:p>
     <w:p>
@@ -102,7 +115,7 @@
         <w:pStyle w:val="Heading2"/>
       </w:pPr>
       <w:r>
-        <w:t>Visualization 6 — Altair Scatter Plot of Income Versus Price by Town</w:t>
+        <w:t>Visualization 7 — Altair Scatter Plot of Income Versus Price by Town</w:t>
       </w:r>
     </w:p>
     <w:p>

</xml_diff>